<commit_message>
feat: se añadieron evidencias de daniel arcila al informe tecnico
</commit_message>
<xml_diff>
--- a/docs/Informe tecnico - Plataforma Distribuida de Telemetria.docx
+++ b/docs/Informe tecnico - Plataforma Distribuida de Telemetria.docx
@@ -231,25 +231,7 @@
           <w:sz w:val="21"/>
           <w:szCs w:val="21"/>
         </w:rPr>
-        <w:t>Semestre 2026-</w:t>
-      </w:r>
-      <w:proofErr w:type="gramStart"/>
-      <w:r>
-        <w:rPr>
-          <w:color w:val="666666"/>
-          <w:sz w:val="21"/>
-          <w:szCs w:val="21"/>
-        </w:rPr>
-        <w:t>2  ·</w:t>
-      </w:r>
-      <w:proofErr w:type="gramEnd"/>
-      <w:r>
-        <w:rPr>
-          <w:color w:val="666666"/>
-          <w:sz w:val="21"/>
-          <w:szCs w:val="21"/>
-        </w:rPr>
-        <w:t xml:space="preserve">  2</w:t>
+        <w:t>Semestre 2026-2  ·  2</w:t>
       </w:r>
       <w:r>
         <w:rPr>
@@ -3974,15 +3956,7 @@
         <w:jc w:val="both"/>
       </w:pPr>
       <w:r>
-        <w:t xml:space="preserve">Los nodos de telemetría, del lado izquierdo, son procesos Python independientes que simulan dispositivos </w:t>
-      </w:r>
-      <w:proofErr w:type="spellStart"/>
-      <w:r>
-        <w:t>IoT</w:t>
-      </w:r>
-      <w:proofErr w:type="spellEnd"/>
-      <w:r>
-        <w:t>. Cada uno posee un identificador único, genera valores para las cuatro variables y los transmite cada cinco segundos. Antes de emitir resuelve el nombre del servidor mediante DNS, de modo que el código no contiene ninguna dirección IP fija.</w:t>
+        <w:t>Los nodos de telemetría, del lado izquierdo, son procesos Python independientes que simulan dispositivos IoT. Cada uno posee un identificador único, genera valores para las cuatro variables y los transmite cada cinco segundos. Antes de emitir resuelve el nombre del servidor mediante DNS, de modo que el código no contiene ninguna dirección IP fija.</w:t>
       </w:r>
     </w:p>
     <w:p>
@@ -4949,25 +4923,7 @@
                 <w:sz w:val="19"/>
                 <w:szCs w:val="19"/>
               </w:rPr>
-              <w:t>GET_</w:t>
-            </w:r>
-            <w:proofErr w:type="gramStart"/>
-            <w:r>
-              <w:rPr>
-                <w:rFonts w:ascii="Consolas" w:eastAsia="Consolas" w:hAnsi="Consolas" w:cs="Consolas"/>
-                <w:sz w:val="19"/>
-                <w:szCs w:val="19"/>
-              </w:rPr>
-              <w:t>STATUS</w:t>
-            </w:r>
-            <w:proofErr w:type="gramEnd"/>
-            <w:r>
-              <w:rPr>
-                <w:rFonts w:ascii="Consolas" w:eastAsia="Consolas" w:hAnsi="Consolas" w:cs="Consolas"/>
-                <w:sz w:val="19"/>
-                <w:szCs w:val="19"/>
-              </w:rPr>
-              <w:t>|&lt;id&gt;</w:t>
+              <w:t>GET_STATUS|&lt;id&gt;</w:t>
             </w:r>
           </w:p>
         </w:tc>
@@ -5116,43 +5072,7 @@
                 <w:sz w:val="19"/>
                 <w:szCs w:val="19"/>
               </w:rPr>
-              <w:t>OK|ALERTS|&lt;n&gt;|&lt;id</w:t>
-            </w:r>
-            <w:proofErr w:type="gramStart"/>
-            <w:r>
-              <w:rPr>
-                <w:rFonts w:ascii="Consolas" w:eastAsia="Consolas" w:hAnsi="Consolas" w:cs="Consolas"/>
-                <w:sz w:val="19"/>
-                <w:szCs w:val="19"/>
-              </w:rPr>
-              <w:t>&gt;,&lt;</w:t>
-            </w:r>
-            <w:proofErr w:type="gramEnd"/>
-            <w:r>
-              <w:rPr>
-                <w:rFonts w:ascii="Consolas" w:eastAsia="Consolas" w:hAnsi="Consolas" w:cs="Consolas"/>
-                <w:sz w:val="19"/>
-                <w:szCs w:val="19"/>
-              </w:rPr>
-              <w:t>tipo</w:t>
-            </w:r>
-            <w:proofErr w:type="gramStart"/>
-            <w:r>
-              <w:rPr>
-                <w:rFonts w:ascii="Consolas" w:eastAsia="Consolas" w:hAnsi="Consolas" w:cs="Consolas"/>
-                <w:sz w:val="19"/>
-                <w:szCs w:val="19"/>
-              </w:rPr>
-              <w:t>&gt;,&lt;</w:t>
-            </w:r>
-            <w:proofErr w:type="gramEnd"/>
-            <w:r>
-              <w:rPr>
-                <w:rFonts w:ascii="Consolas" w:eastAsia="Consolas" w:hAnsi="Consolas" w:cs="Consolas"/>
-                <w:sz w:val="19"/>
-                <w:szCs w:val="19"/>
-              </w:rPr>
-              <w:t>valor&gt;...</w:t>
+              <w:t>OK|ALERTS|&lt;n&gt;|&lt;id&gt;,&lt;tipo&gt;,&lt;valor&gt;...</w:t>
             </w:r>
           </w:p>
         </w:tc>
@@ -5194,17 +5114,8 @@
                 <w:sz w:val="19"/>
                 <w:szCs w:val="19"/>
               </w:rPr>
-              <w:t>GET_SYSTEM_</w:t>
-            </w:r>
-            <w:proofErr w:type="gramStart"/>
-            <w:r>
-              <w:rPr>
-                <w:sz w:val="19"/>
-                <w:szCs w:val="19"/>
-              </w:rPr>
-              <w:t>STATUS</w:t>
-            </w:r>
-            <w:proofErr w:type="gramEnd"/>
+              <w:t>GET_SYSTEM_STATUS</w:t>
+            </w:r>
           </w:p>
         </w:tc>
         <w:tc>
@@ -5415,25 +5326,7 @@
           <w:sz w:val="18"/>
           <w:szCs w:val="18"/>
         </w:rPr>
-        <w:t>Operador -&gt; Servidor:  GET_</w:t>
-      </w:r>
-      <w:proofErr w:type="gramStart"/>
-      <w:r>
-        <w:rPr>
-          <w:rFonts w:ascii="Consolas" w:eastAsia="Consolas" w:hAnsi="Consolas" w:cs="Consolas"/>
-          <w:sz w:val="18"/>
-          <w:szCs w:val="18"/>
-        </w:rPr>
-        <w:t>STATUS</w:t>
-      </w:r>
-      <w:proofErr w:type="gramEnd"/>
-      <w:r>
-        <w:rPr>
-          <w:rFonts w:ascii="Consolas" w:eastAsia="Consolas" w:hAnsi="Consolas" w:cs="Consolas"/>
-          <w:sz w:val="18"/>
-          <w:szCs w:val="18"/>
-        </w:rPr>
-        <w:t>|3</w:t>
+        <w:t>Operador -&gt; Servidor:  GET_STATUS|3</w:t>
       </w:r>
     </w:p>
     <w:p>
@@ -5475,23 +5368,7 @@
         <w:jc w:val="both"/>
       </w:pPr>
       <w:r>
-        <w:t>Dos reglas del protocolo dependen del estado que mantiene el servidor y afectan a la interpretación de las respuestas. Un nodo se considera activo si reportó en los últimos quince segundos; el comando GET_NODES lista únicamente los activos, mientras que GET_SYSTEM_</w:t>
-      </w:r>
-      <w:proofErr w:type="gramStart"/>
-      <w:r>
-        <w:t>STATUS</w:t>
-      </w:r>
-      <w:proofErr w:type="gramEnd"/>
-      <w:r>
-        <w:t xml:space="preserve"> cuenta todos los registrados desde el arranque. Un nodo detenido desaparece del primer </w:t>
-      </w:r>
-      <w:proofErr w:type="gramStart"/>
-      <w:r>
-        <w:t>listado</w:t>
-      </w:r>
-      <w:proofErr w:type="gramEnd"/>
-      <w:r>
-        <w:t xml:space="preserve"> pero sigue contando en el segundo.</w:t>
+        <w:t>Dos reglas del protocolo dependen del estado que mantiene el servidor y afectan a la interpretación de las respuestas. Un nodo se considera activo si reportó en los últimos quince segundos; el comando GET_NODES lista únicamente los activos, mientras que GET_SYSTEM_STATUS cuenta todos los registrados desde el arranque. Un nodo detenido desaparece del primer listado pero sigue contando en el segundo.</w:t>
       </w:r>
     </w:p>
     <w:p>
@@ -5546,23 +5423,7 @@
         <w:jc w:val="both"/>
       </w:pPr>
       <w:r>
-        <w:t xml:space="preserve">El servidor crea el socket de telemetría mediante una llamada a socket con la familia AF_INET y el tipo SOCK_DGRAM, que selecciona el servicio de datagramas. A </w:t>
-      </w:r>
-      <w:proofErr w:type="gramStart"/>
-      <w:r>
-        <w:t>continuación</w:t>
-      </w:r>
-      <w:proofErr w:type="gramEnd"/>
-      <w:r>
-        <w:t xml:space="preserve"> asocia la dirección con </w:t>
-      </w:r>
-      <w:proofErr w:type="spellStart"/>
-      <w:r>
-        <w:t>bind</w:t>
-      </w:r>
-      <w:proofErr w:type="spellEnd"/>
-      <w:r>
-        <w:t>, empleando INADDR_ANY para aceptar tráfico dirigido a cualquier interfaz del equipo, condición necesaria para que el contenedor reciba paquetes procedentes de Internet.</w:t>
+        <w:t>El servidor crea el socket de telemetría mediante una llamada a socket con la familia AF_INET y el tipo SOCK_DGRAM, que selecciona el servicio de datagramas. A continuación asocia la dirección con bind, empleando INADDR_ANY para aceptar tráfico dirigido a cualquier interfaz del equipo, condición necesaria para que el contenedor reciba paquetes procedentes de Internet.</w:t>
       </w:r>
     </w:p>
     <w:p>
@@ -5571,23 +5432,7 @@
         <w:jc w:val="both"/>
       </w:pPr>
       <w:r>
-        <w:t xml:space="preserve">No existen llamadas a listen ni a </w:t>
-      </w:r>
-      <w:proofErr w:type="spellStart"/>
-      <w:r>
-        <w:t>accept</w:t>
-      </w:r>
-      <w:proofErr w:type="spellEnd"/>
-      <w:r>
-        <w:t xml:space="preserve">, porque UDP no establece conexiones: el socket queda directamente en disposición de recibir. La recepción se realiza en un bucle infinito mediante </w:t>
-      </w:r>
-      <w:proofErr w:type="spellStart"/>
-      <w:r>
-        <w:t>recvfrom</w:t>
-      </w:r>
-      <w:proofErr w:type="spellEnd"/>
-      <w:r>
-        <w:t>, función que además entrega la dirección del emisor, lo que permite registrar en consola la dirección de origen de cada medición.</w:t>
+        <w:t>No existen llamadas a listen ni a accept, porque UDP no establece conexiones: el socket queda directamente en disposición de recibir. La recepción se realiza en un bucle infinito mediante recvfrom, función que además entrega la dirección del emisor, lo que permite registrar en consola la dirección de origen de cada medición.</w:t>
       </w:r>
     </w:p>
     <w:p>
@@ -5596,23 +5441,7 @@
         <w:jc w:val="both"/>
       </w:pPr>
       <w:r>
-        <w:t xml:space="preserve">El tratamiento de errores distingue dos situaciones. Los fallos en la creación del socket o en el </w:t>
-      </w:r>
-      <w:proofErr w:type="spellStart"/>
-      <w:r>
-        <w:t>bind</w:t>
-      </w:r>
-      <w:proofErr w:type="spellEnd"/>
-      <w:r>
-        <w:t xml:space="preserve"> son irrecuperables y terminan el proceso con un mensaje de diagnóstico. En cambio, un error puntual en </w:t>
-      </w:r>
-      <w:proofErr w:type="spellStart"/>
-      <w:r>
-        <w:t>recvfrom</w:t>
-      </w:r>
-      <w:proofErr w:type="spellEnd"/>
-      <w:r>
-        <w:t xml:space="preserve"> no detiene el servidor: el código lo reporta y continúa el bucle, de modo que un paquete problemático no interrumpe el servicio para los demás nodos.</w:t>
+        <w:t>El tratamiento de errores distingue dos situaciones. Los fallos en la creación del socket o en el bind son irrecuperables y terminan el proceso con un mensaje de diagnóstico. En cambio, un error puntual en recvfrom no detiene el servidor: el código lo reporta y continúa el bucle, de modo que un paquete problemático no interrumpe el servicio para los demás nodos.</w:t>
       </w:r>
     </w:p>
     <w:p>
@@ -5657,23 +5486,7 @@
         <w:jc w:val="both"/>
       </w:pPr>
       <w:r>
-        <w:t xml:space="preserve">La secuencia continúa con </w:t>
-      </w:r>
-      <w:proofErr w:type="spellStart"/>
-      <w:r>
-        <w:t>bind</w:t>
-      </w:r>
-      <w:proofErr w:type="spellEnd"/>
-      <w:r>
-        <w:t xml:space="preserve"> y listen, este último con una cola de diez conexiones pendientes. El servidor entra entonces en un bucle permanente de </w:t>
-      </w:r>
-      <w:proofErr w:type="spellStart"/>
-      <w:r>
-        <w:t>accept</w:t>
-      </w:r>
-      <w:proofErr w:type="spellEnd"/>
-      <w:r>
-        <w:t>, que bloquea hasta que un operador solicita conexión y devuelve un descriptor nuevo dedicado a ese cliente.</w:t>
+        <w:t>La secuencia continúa con bind y listen, este último con una cola de diez conexiones pendientes. El servidor entra entonces en un bucle permanente de accept, que bloquea hasta que un operador solicita conexión y devuelve un descriptor nuevo dedicado a ese cliente.</w:t>
       </w:r>
     </w:p>
     <w:p>
@@ -5701,23 +5514,7 @@
         <w:jc w:val="both"/>
       </w:pPr>
       <w:r>
-        <w:t xml:space="preserve">El envío de la respuesta se realiza dentro de un bucle que contabiliza los bytes efectivamente transmitidos y reintenta hasta completar el total. Esta precaución es necesaria porque </w:t>
-      </w:r>
-      <w:proofErr w:type="spellStart"/>
-      <w:r>
-        <w:t>send</w:t>
-      </w:r>
-      <w:proofErr w:type="spellEnd"/>
-      <w:r>
-        <w:t xml:space="preserve"> puede transmitir menos bytes de los solicitados cuando el búfer del sistema está lleno, situación verosímil con respuestas extensas como la de GET_ALERTS, que llegó a ocupar cerca de tres mil bytes durante las pruebas. </w:t>
-      </w:r>
-      <w:proofErr w:type="gramStart"/>
-      <w:r>
-        <w:t>Finalmente</w:t>
-      </w:r>
-      <w:proofErr w:type="gramEnd"/>
-      <w:r>
-        <w:t xml:space="preserve"> el descriptor se cierra.</w:t>
+        <w:t>El envío de la respuesta se realiza dentro de un bucle que contabiliza los bytes efectivamente transmitidos y reintenta hasta completar el total. Esta precaución es necesaria porque send puede transmitir menos bytes de los solicitados cuando el búfer del sistema está lleno, situación verosímil con respuestas extensas como la de GET_ALERTS, que llegó a ocupar cerca de tres mil bytes durante las pruebas. Finalmente el descriptor se cierra.</w:t>
       </w:r>
     </w:p>
     <w:p>
@@ -5744,15 +5541,7 @@
         <w:jc w:val="both"/>
       </w:pPr>
       <w:r>
-        <w:t xml:space="preserve">Los nodos de telemetría comienzan resolviendo el nombre del servidor mediante </w:t>
-      </w:r>
-      <w:proofErr w:type="spellStart"/>
-      <w:r>
-        <w:t>gethostbyname</w:t>
-      </w:r>
-      <w:proofErr w:type="spellEnd"/>
-      <w:r>
-        <w:t>. Esta llamada materializa el requisito de localizar el servidor por DNS: el código no contiene ninguna dirección, y el nombre se recibe como argumento de línea de órdenes. Un fallo de resolución se captura como excepción específica y el nodo termina con un mensaje explicativo en lugar de abortar con una traza.</w:t>
+        <w:t>Los nodos de telemetría comienzan resolviendo el nombre del servidor mediante gethostbyname. Esta llamada materializa el requisito de localizar el servidor por DNS: el código no contiene ninguna dirección, y el nombre se recibe como argumento de línea de órdenes. Un fallo de resolución se captura como excepción específica y el nodo termina con un mensaje explicativo en lugar de abortar con una traza.</w:t>
       </w:r>
     </w:p>
     <w:p>
@@ -5761,23 +5550,7 @@
         <w:jc w:val="both"/>
       </w:pPr>
       <w:r>
-        <w:t xml:space="preserve">El socket se crea con el tipo de datagramas y el envío se realiza con </w:t>
-      </w:r>
-      <w:proofErr w:type="spellStart"/>
-      <w:r>
-        <w:t>sendto</w:t>
-      </w:r>
-      <w:proofErr w:type="spellEnd"/>
-      <w:r>
-        <w:t xml:space="preserve">, indicando destino en cada llamada, puesto que un socket UDP no conserva un interlocutor fijo. El cierre se garantiza mediante un bloque </w:t>
-      </w:r>
-      <w:proofErr w:type="spellStart"/>
-      <w:r>
-        <w:t>finally</w:t>
-      </w:r>
-      <w:proofErr w:type="spellEnd"/>
-      <w:r>
-        <w:t>, que se ejecuta incluso cuando el nodo se detiene con una interrupción de teclado.</w:t>
+        <w:t>El socket se crea con el tipo de datagramas y el envío se realiza con sendto, indicando destino en cada llamada, puesto que un socket UDP no conserva un interlocutor fijo. El cierre se garantiza mediante un bloque finally, que se ejecuta incluso cuando el nodo se detiene con una interrupción de teclado.</w:t>
       </w:r>
     </w:p>
     <w:p>
@@ -5786,39 +5559,7 @@
         <w:jc w:val="both"/>
       </w:pPr>
       <w:r>
-        <w:t xml:space="preserve">El cliente operador crea un socket de flujo, fija un tiempo máximo de espera de cinco segundos y establece la conexión con </w:t>
-      </w:r>
-      <w:proofErr w:type="spellStart"/>
-      <w:r>
-        <w:t>connect</w:t>
-      </w:r>
-      <w:proofErr w:type="spellEnd"/>
-      <w:r>
-        <w:t xml:space="preserve">. El envío emplea </w:t>
-      </w:r>
-      <w:proofErr w:type="spellStart"/>
-      <w:r>
-        <w:t>sendall</w:t>
-      </w:r>
-      <w:proofErr w:type="spellEnd"/>
-      <w:r>
-        <w:t xml:space="preserve">, que a diferencia de </w:t>
-      </w:r>
-      <w:proofErr w:type="spellStart"/>
-      <w:r>
-        <w:t>send</w:t>
-      </w:r>
-      <w:proofErr w:type="spellEnd"/>
-      <w:r>
-        <w:t xml:space="preserve"> garantiza la transmisión completa del comando. La recepción se realiza en un bucle que acumula fragmentos hasta que </w:t>
-      </w:r>
-      <w:proofErr w:type="spellStart"/>
-      <w:r>
-        <w:t>recv</w:t>
-      </w:r>
-      <w:proofErr w:type="spellEnd"/>
-      <w:r>
-        <w:t xml:space="preserve"> devuelve una cadena vacía, condición que en TCP señala que el otro extremo ha cerrado su lado de la conexión; ese es precisamente el mecanismo por el que el cliente detecta el final de la respuesta, dado que el protocolo no incluye un delimitador explícito de fin de mensaje.</w:t>
+        <w:t>El cliente operador crea un socket de flujo, fija un tiempo máximo de espera de cinco segundos y establece la conexión con connect. El envío emplea sendall, que a diferencia de send garantiza la transmisión completa del comando. La recepción se realiza en un bucle que acumula fragmentos hasta que recv devuelve una cadena vacía, condición que en TCP señala que el otro extremo ha cerrado su lado de la conexión; ese es precisamente el mecanismo por el que el cliente detecta el final de la respuesta, dado que el protocolo no incluye un delimitador explícito de fin de mensaje.</w:t>
       </w:r>
     </w:p>
     <w:p>
@@ -6033,64 +5774,28 @@
                 <w:sz w:val="19"/>
                 <w:szCs w:val="19"/>
               </w:rPr>
-              <w:t>udp_</w:t>
-            </w:r>
-            <w:proofErr w:type="gramStart"/>
+              <w:t>udp_server.c:57</w:t>
+            </w:r>
+          </w:p>
+        </w:tc>
+        <w:tc>
+          <w:tcPr>
+            <w:tcW w:w="2200" w:type="dxa"/>
+            <w:tcMar>
+              <w:top w:w="60" w:type="dxa"/>
+              <w:left w:w="90" w:type="dxa"/>
+              <w:bottom w:w="60" w:type="dxa"/>
+              <w:right w:w="90" w:type="dxa"/>
+            </w:tcMar>
+          </w:tcPr>
+          <w:p>
             <w:r>
               <w:rPr>
                 <w:rFonts w:ascii="Consolas" w:eastAsia="Consolas" w:hAnsi="Consolas" w:cs="Consolas"/>
                 <w:sz w:val="19"/>
                 <w:szCs w:val="19"/>
               </w:rPr>
-              <w:t>server</w:t>
-            </w:r>
-            <w:proofErr w:type="gramEnd"/>
-            <w:r>
-              <w:rPr>
-                <w:rFonts w:ascii="Consolas" w:eastAsia="Consolas" w:hAnsi="Consolas" w:cs="Consolas"/>
-                <w:sz w:val="19"/>
-                <w:szCs w:val="19"/>
-              </w:rPr>
-              <w:t>.c:57</w:t>
-            </w:r>
-          </w:p>
-        </w:tc>
-        <w:tc>
-          <w:tcPr>
-            <w:tcW w:w="2200" w:type="dxa"/>
-            <w:tcMar>
-              <w:top w:w="60" w:type="dxa"/>
-              <w:left w:w="90" w:type="dxa"/>
-              <w:bottom w:w="60" w:type="dxa"/>
-              <w:right w:w="90" w:type="dxa"/>
-            </w:tcMar>
-          </w:tcPr>
-          <w:p>
-            <w:r>
-              <w:rPr>
-                <w:rFonts w:ascii="Consolas" w:eastAsia="Consolas" w:hAnsi="Consolas" w:cs="Consolas"/>
-                <w:sz w:val="19"/>
-                <w:szCs w:val="19"/>
-              </w:rPr>
-              <w:t>tcp_</w:t>
-            </w:r>
-            <w:proofErr w:type="gramStart"/>
-            <w:r>
-              <w:rPr>
-                <w:rFonts w:ascii="Consolas" w:eastAsia="Consolas" w:hAnsi="Consolas" w:cs="Consolas"/>
-                <w:sz w:val="19"/>
-                <w:szCs w:val="19"/>
-              </w:rPr>
-              <w:t>server</w:t>
-            </w:r>
-            <w:proofErr w:type="gramEnd"/>
-            <w:r>
-              <w:rPr>
-                <w:rFonts w:ascii="Consolas" w:eastAsia="Consolas" w:hAnsi="Consolas" w:cs="Consolas"/>
-                <w:sz w:val="19"/>
-                <w:szCs w:val="19"/>
-              </w:rPr>
-              <w:t>.c:123</w:t>
+              <w:t>tcp_server.c:123</w:t>
             </w:r>
           </w:p>
         </w:tc>
@@ -6154,64 +5859,28 @@
                 <w:sz w:val="19"/>
                 <w:szCs w:val="19"/>
               </w:rPr>
-              <w:t>udp_</w:t>
-            </w:r>
-            <w:proofErr w:type="gramStart"/>
+              <w:t>udp_server.c:111</w:t>
+            </w:r>
+          </w:p>
+        </w:tc>
+        <w:tc>
+          <w:tcPr>
+            <w:tcW w:w="2200" w:type="dxa"/>
+            <w:tcMar>
+              <w:top w:w="60" w:type="dxa"/>
+              <w:left w:w="90" w:type="dxa"/>
+              <w:bottom w:w="60" w:type="dxa"/>
+              <w:right w:w="90" w:type="dxa"/>
+            </w:tcMar>
+          </w:tcPr>
+          <w:p>
             <w:r>
               <w:rPr>
                 <w:rFonts w:ascii="Consolas" w:eastAsia="Consolas" w:hAnsi="Consolas" w:cs="Consolas"/>
                 <w:sz w:val="19"/>
                 <w:szCs w:val="19"/>
               </w:rPr>
-              <w:t>server</w:t>
-            </w:r>
-            <w:proofErr w:type="gramEnd"/>
-            <w:r>
-              <w:rPr>
-                <w:rFonts w:ascii="Consolas" w:eastAsia="Consolas" w:hAnsi="Consolas" w:cs="Consolas"/>
-                <w:sz w:val="19"/>
-                <w:szCs w:val="19"/>
-              </w:rPr>
-              <w:t>.c:111</w:t>
-            </w:r>
-          </w:p>
-        </w:tc>
-        <w:tc>
-          <w:tcPr>
-            <w:tcW w:w="2200" w:type="dxa"/>
-            <w:tcMar>
-              <w:top w:w="60" w:type="dxa"/>
-              <w:left w:w="90" w:type="dxa"/>
-              <w:bottom w:w="60" w:type="dxa"/>
-              <w:right w:w="90" w:type="dxa"/>
-            </w:tcMar>
-          </w:tcPr>
-          <w:p>
-            <w:r>
-              <w:rPr>
-                <w:rFonts w:ascii="Consolas" w:eastAsia="Consolas" w:hAnsi="Consolas" w:cs="Consolas"/>
-                <w:sz w:val="19"/>
-                <w:szCs w:val="19"/>
-              </w:rPr>
-              <w:t>tcp_</w:t>
-            </w:r>
-            <w:proofErr w:type="gramStart"/>
-            <w:r>
-              <w:rPr>
-                <w:rFonts w:ascii="Consolas" w:eastAsia="Consolas" w:hAnsi="Consolas" w:cs="Consolas"/>
-                <w:sz w:val="19"/>
-                <w:szCs w:val="19"/>
-              </w:rPr>
-              <w:t>server</w:t>
-            </w:r>
-            <w:proofErr w:type="gramEnd"/>
-            <w:r>
-              <w:rPr>
-                <w:rFonts w:ascii="Consolas" w:eastAsia="Consolas" w:hAnsi="Consolas" w:cs="Consolas"/>
-                <w:sz w:val="19"/>
-                <w:szCs w:val="19"/>
-              </w:rPr>
-              <w:t>.c:131</w:t>
+              <w:t>tcp_server.c:131</w:t>
             </w:r>
           </w:p>
         </w:tc>
@@ -6294,25 +5963,7 @@
                 <w:sz w:val="19"/>
                 <w:szCs w:val="19"/>
               </w:rPr>
-              <w:t>tcp_</w:t>
-            </w:r>
-            <w:proofErr w:type="gramStart"/>
-            <w:r>
-              <w:rPr>
-                <w:rFonts w:ascii="Consolas" w:eastAsia="Consolas" w:hAnsi="Consolas" w:cs="Consolas"/>
-                <w:sz w:val="19"/>
-                <w:szCs w:val="19"/>
-              </w:rPr>
-              <w:t>server</w:t>
-            </w:r>
-            <w:proofErr w:type="gramEnd"/>
-            <w:r>
-              <w:rPr>
-                <w:rFonts w:ascii="Consolas" w:eastAsia="Consolas" w:hAnsi="Consolas" w:cs="Consolas"/>
-                <w:sz w:val="19"/>
-                <w:szCs w:val="19"/>
-              </w:rPr>
-              <w:t>.c:141</w:t>
+              <w:t>tcp_server.c:141</w:t>
             </w:r>
           </w:p>
         </w:tc>
@@ -6479,25 +6130,7 @@
                 <w:sz w:val="19"/>
                 <w:szCs w:val="19"/>
               </w:rPr>
-              <w:t>tcp_</w:t>
-            </w:r>
-            <w:proofErr w:type="gramStart"/>
-            <w:r>
-              <w:rPr>
-                <w:rFonts w:ascii="Consolas" w:eastAsia="Consolas" w:hAnsi="Consolas" w:cs="Consolas"/>
-                <w:sz w:val="19"/>
-                <w:szCs w:val="19"/>
-              </w:rPr>
-              <w:t>server</w:t>
-            </w:r>
-            <w:proofErr w:type="gramEnd"/>
-            <w:r>
-              <w:rPr>
-                <w:rFonts w:ascii="Consolas" w:eastAsia="Consolas" w:hAnsi="Consolas" w:cs="Consolas"/>
-                <w:sz w:val="19"/>
-                <w:szCs w:val="19"/>
-              </w:rPr>
-              <w:t>.c:112</w:t>
+              <w:t>tcp_server.c:112</w:t>
             </w:r>
           </w:p>
         </w:tc>
@@ -6561,64 +6194,28 @@
                 <w:sz w:val="19"/>
                 <w:szCs w:val="19"/>
               </w:rPr>
-              <w:t>udp_</w:t>
-            </w:r>
-            <w:proofErr w:type="gramStart"/>
+              <w:t>udp_server.c:152</w:t>
+            </w:r>
+          </w:p>
+        </w:tc>
+        <w:tc>
+          <w:tcPr>
+            <w:tcW w:w="2200" w:type="dxa"/>
+            <w:tcMar>
+              <w:top w:w="60" w:type="dxa"/>
+              <w:left w:w="90" w:type="dxa"/>
+              <w:bottom w:w="60" w:type="dxa"/>
+              <w:right w:w="90" w:type="dxa"/>
+            </w:tcMar>
+          </w:tcPr>
+          <w:p>
             <w:r>
               <w:rPr>
                 <w:rFonts w:ascii="Consolas" w:eastAsia="Consolas" w:hAnsi="Consolas" w:cs="Consolas"/>
                 <w:sz w:val="19"/>
                 <w:szCs w:val="19"/>
               </w:rPr>
-              <w:t>server</w:t>
-            </w:r>
-            <w:proofErr w:type="gramEnd"/>
-            <w:r>
-              <w:rPr>
-                <w:rFonts w:ascii="Consolas" w:eastAsia="Consolas" w:hAnsi="Consolas" w:cs="Consolas"/>
-                <w:sz w:val="19"/>
-                <w:szCs w:val="19"/>
-              </w:rPr>
-              <w:t>.c:152</w:t>
-            </w:r>
-          </w:p>
-        </w:tc>
-        <w:tc>
-          <w:tcPr>
-            <w:tcW w:w="2200" w:type="dxa"/>
-            <w:tcMar>
-              <w:top w:w="60" w:type="dxa"/>
-              <w:left w:w="90" w:type="dxa"/>
-              <w:bottom w:w="60" w:type="dxa"/>
-              <w:right w:w="90" w:type="dxa"/>
-            </w:tcMar>
-          </w:tcPr>
-          <w:p>
-            <w:r>
-              <w:rPr>
-                <w:rFonts w:ascii="Consolas" w:eastAsia="Consolas" w:hAnsi="Consolas" w:cs="Consolas"/>
-                <w:sz w:val="19"/>
-                <w:szCs w:val="19"/>
-              </w:rPr>
-              <w:t>tcp_</w:t>
-            </w:r>
-            <w:proofErr w:type="gramStart"/>
-            <w:r>
-              <w:rPr>
-                <w:rFonts w:ascii="Consolas" w:eastAsia="Consolas" w:hAnsi="Consolas" w:cs="Consolas"/>
-                <w:sz w:val="19"/>
-                <w:szCs w:val="19"/>
-              </w:rPr>
-              <w:t>server</w:t>
-            </w:r>
-            <w:proofErr w:type="gramEnd"/>
-            <w:r>
-              <w:rPr>
-                <w:rFonts w:ascii="Consolas" w:eastAsia="Consolas" w:hAnsi="Consolas" w:cs="Consolas"/>
-                <w:sz w:val="19"/>
-                <w:szCs w:val="19"/>
-              </w:rPr>
-              <w:t>.c:94</w:t>
+              <w:t>tcp_server.c:94</w:t>
             </w:r>
           </w:p>
         </w:tc>
@@ -6682,64 +6279,28 @@
                 <w:sz w:val="19"/>
                 <w:szCs w:val="19"/>
               </w:rPr>
-              <w:t>udp_</w:t>
-            </w:r>
-            <w:proofErr w:type="gramStart"/>
+              <w:t>udp_server.c:255</w:t>
+            </w:r>
+          </w:p>
+        </w:tc>
+        <w:tc>
+          <w:tcPr>
+            <w:tcW w:w="2200" w:type="dxa"/>
+            <w:tcMar>
+              <w:top w:w="60" w:type="dxa"/>
+              <w:left w:w="90" w:type="dxa"/>
+              <w:bottom w:w="60" w:type="dxa"/>
+              <w:right w:w="90" w:type="dxa"/>
+            </w:tcMar>
+          </w:tcPr>
+          <w:p>
             <w:r>
               <w:rPr>
                 <w:rFonts w:ascii="Consolas" w:eastAsia="Consolas" w:hAnsi="Consolas" w:cs="Consolas"/>
                 <w:sz w:val="19"/>
                 <w:szCs w:val="19"/>
               </w:rPr>
-              <w:t>server</w:t>
-            </w:r>
-            <w:proofErr w:type="gramEnd"/>
-            <w:r>
-              <w:rPr>
-                <w:rFonts w:ascii="Consolas" w:eastAsia="Consolas" w:hAnsi="Consolas" w:cs="Consolas"/>
-                <w:sz w:val="19"/>
-                <w:szCs w:val="19"/>
-              </w:rPr>
-              <w:t>.c:255</w:t>
-            </w:r>
-          </w:p>
-        </w:tc>
-        <w:tc>
-          <w:tcPr>
-            <w:tcW w:w="2200" w:type="dxa"/>
-            <w:tcMar>
-              <w:top w:w="60" w:type="dxa"/>
-              <w:left w:w="90" w:type="dxa"/>
-              <w:bottom w:w="60" w:type="dxa"/>
-              <w:right w:w="90" w:type="dxa"/>
-            </w:tcMar>
-          </w:tcPr>
-          <w:p>
-            <w:r>
-              <w:rPr>
-                <w:rFonts w:ascii="Consolas" w:eastAsia="Consolas" w:hAnsi="Consolas" w:cs="Consolas"/>
-                <w:sz w:val="19"/>
-                <w:szCs w:val="19"/>
-              </w:rPr>
-              <w:t>tcp_</w:t>
-            </w:r>
-            <w:proofErr w:type="gramStart"/>
-            <w:r>
-              <w:rPr>
-                <w:rFonts w:ascii="Consolas" w:eastAsia="Consolas" w:hAnsi="Consolas" w:cs="Consolas"/>
-                <w:sz w:val="19"/>
-                <w:szCs w:val="19"/>
-              </w:rPr>
-              <w:t>server</w:t>
-            </w:r>
-            <w:proofErr w:type="gramEnd"/>
-            <w:r>
-              <w:rPr>
-                <w:rFonts w:ascii="Consolas" w:eastAsia="Consolas" w:hAnsi="Consolas" w:cs="Consolas"/>
-                <w:sz w:val="19"/>
-                <w:szCs w:val="19"/>
-              </w:rPr>
-              <w:t>.c:117</w:t>
+              <w:t>tcp_server.c:117</w:t>
             </w:r>
           </w:p>
         </w:tc>
@@ -6803,64 +6364,28 @@
                 <w:sz w:val="19"/>
                 <w:szCs w:val="19"/>
               </w:rPr>
-              <w:t>udp_</w:t>
-            </w:r>
-            <w:proofErr w:type="gramStart"/>
+              <w:t>udp_server.c:163</w:t>
+            </w:r>
+          </w:p>
+        </w:tc>
+        <w:tc>
+          <w:tcPr>
+            <w:tcW w:w="2200" w:type="dxa"/>
+            <w:tcMar>
+              <w:top w:w="60" w:type="dxa"/>
+              <w:left w:w="90" w:type="dxa"/>
+              <w:bottom w:w="60" w:type="dxa"/>
+              <w:right w:w="90" w:type="dxa"/>
+            </w:tcMar>
+          </w:tcPr>
+          <w:p>
             <w:r>
               <w:rPr>
                 <w:rFonts w:ascii="Consolas" w:eastAsia="Consolas" w:hAnsi="Consolas" w:cs="Consolas"/>
                 <w:sz w:val="19"/>
                 <w:szCs w:val="19"/>
               </w:rPr>
-              <w:t>server</w:t>
-            </w:r>
-            <w:proofErr w:type="gramEnd"/>
-            <w:r>
-              <w:rPr>
-                <w:rFonts w:ascii="Consolas" w:eastAsia="Consolas" w:hAnsi="Consolas" w:cs="Consolas"/>
-                <w:sz w:val="19"/>
-                <w:szCs w:val="19"/>
-              </w:rPr>
-              <w:t>.c:163</w:t>
-            </w:r>
-          </w:p>
-        </w:tc>
-        <w:tc>
-          <w:tcPr>
-            <w:tcW w:w="2200" w:type="dxa"/>
-            <w:tcMar>
-              <w:top w:w="60" w:type="dxa"/>
-              <w:left w:w="90" w:type="dxa"/>
-              <w:bottom w:w="60" w:type="dxa"/>
-              <w:right w:w="90" w:type="dxa"/>
-            </w:tcMar>
-          </w:tcPr>
-          <w:p>
-            <w:r>
-              <w:rPr>
-                <w:rFonts w:ascii="Consolas" w:eastAsia="Consolas" w:hAnsi="Consolas" w:cs="Consolas"/>
-                <w:sz w:val="19"/>
-                <w:szCs w:val="19"/>
-              </w:rPr>
-              <w:t>tcp_</w:t>
-            </w:r>
-            <w:proofErr w:type="gramStart"/>
-            <w:r>
-              <w:rPr>
-                <w:rFonts w:ascii="Consolas" w:eastAsia="Consolas" w:hAnsi="Consolas" w:cs="Consolas"/>
-                <w:sz w:val="19"/>
-                <w:szCs w:val="19"/>
-              </w:rPr>
-              <w:t>server</w:t>
-            </w:r>
-            <w:proofErr w:type="gramEnd"/>
-            <w:r>
-              <w:rPr>
-                <w:rFonts w:ascii="Consolas" w:eastAsia="Consolas" w:hAnsi="Consolas" w:cs="Consolas"/>
-                <w:sz w:val="19"/>
-                <w:szCs w:val="19"/>
-              </w:rPr>
-              <w:t>.c:102</w:t>
+              <w:t>tcp_server.c:102</w:t>
             </w:r>
           </w:p>
         </w:tc>
@@ -6899,27 +6424,7 @@
           <w:sz w:val="20"/>
           <w:szCs w:val="20"/>
         </w:rPr>
-        <w:t xml:space="preserve">La llamada a </w:t>
-      </w:r>
-      <w:proofErr w:type="spellStart"/>
-      <w:r>
-        <w:rPr>
-          <w:i/>
-          <w:iCs/>
-          <w:sz w:val="20"/>
-          <w:szCs w:val="20"/>
-        </w:rPr>
-        <w:t>close</w:t>
-      </w:r>
-      <w:proofErr w:type="spellEnd"/>
-      <w:r>
-        <w:rPr>
-          <w:i/>
-          <w:iCs/>
-          <w:sz w:val="20"/>
-          <w:szCs w:val="20"/>
-        </w:rPr>
-        <w:t xml:space="preserve"> del socket UDP está escrita tras el bucle de recepción, que es infinito, por lo que en la práctica no llega a ejecutarse: el descriptor lo libera el sistema operativo al terminar el proceso. Es aceptable en un servicio cuyo ciclo de vida coincide con el del programa, pero se señala por rigor. El cierre efectivo y verificable en cada operación corresponde al socket TCP de cada cliente, que sí se cierra explícitamente al completar la respuesta.</w:t>
+        <w:t>La llamada a close del socket UDP está escrita tras el bucle de recepción, que es infinito, por lo que en la práctica no llega a ejecutarse: el descriptor lo libera el sistema operativo al terminar el proceso. Es aceptable en un servicio cuyo ciclo de vida coincide con el del programa, pero se señala por rigor. El cierre efectivo y verificable en cada operación corresponde al socket TCP de cada cliente, que sí se cierra explícitamente al completar la respuesta.</w:t>
       </w:r>
     </w:p>
     <w:p>
@@ -6991,23 +6496,7 @@
         <w:jc w:val="both"/>
       </w:pPr>
       <w:r>
-        <w:t xml:space="preserve">Se descartó el uso de procesos independientes porque los componentes del servidor comparten el mismo estado —el registro de nodos y el historial de alertas—, y con procesos habría sido necesario recurrir a memoria compartida o a algún mecanismo de comunicación entre procesos, aumentando la complejidad sin beneficio. También se descartó la multiplexación de sockets mediante </w:t>
-      </w:r>
-      <w:proofErr w:type="spellStart"/>
-      <w:r>
-        <w:t>select</w:t>
-      </w:r>
-      <w:proofErr w:type="spellEnd"/>
-      <w:r>
-        <w:t xml:space="preserve"> o </w:t>
-      </w:r>
-      <w:proofErr w:type="spellStart"/>
-      <w:r>
-        <w:t>poll</w:t>
-      </w:r>
-      <w:proofErr w:type="spellEnd"/>
-      <w:r>
-        <w:t>, que habría evitado los hilos a costa de una máquina de estados considerablemente más difícil de leer y mantener.</w:t>
+        <w:t>Se descartó el uso de procesos independientes porque los componentes del servidor comparten el mismo estado —el registro de nodos y el historial de alertas—, y con procesos habría sido necesario recurrir a memoria compartida o a algún mecanismo de comunicación entre procesos, aumentando la complejidad sin beneficio. También se descartó la multiplexación de sockets mediante select o poll, que habría evitado los hilos a costa de una máquina de estados considerablemente más difícil de leer y mantener.</w:t>
       </w:r>
     </w:p>
     <w:p>
@@ -7219,15 +6708,7 @@
         <w:jc w:val="both"/>
       </w:pPr>
       <w:r>
-        <w:t xml:space="preserve">El servidor se desplegó sobre una instancia de Amazon EC2 dentro de un entorno AWS </w:t>
-      </w:r>
-      <w:proofErr w:type="spellStart"/>
-      <w:r>
-        <w:t>Academy</w:t>
-      </w:r>
-      <w:proofErr w:type="spellEnd"/>
-      <w:r>
-        <w:t xml:space="preserve"> Learner Lab. La Tabla 4 resume los datos del despliegue documentado.</w:t>
+        <w:t>El servidor se desplegó sobre una instancia de Amazon EC2 dentro de un entorno AWS Academy Learner Lab. La Tabla 4 resume los datos del despliegue documentado.</w:t>
       </w:r>
     </w:p>
     <w:p>
@@ -7445,17 +6926,8 @@
                 <w:sz w:val="19"/>
                 <w:szCs w:val="19"/>
               </w:rPr>
-              <w:t>t</w:t>
-            </w:r>
-            <w:proofErr w:type="gramStart"/>
-            <w:r>
-              <w:rPr>
-                <w:sz w:val="19"/>
-                <w:szCs w:val="19"/>
-              </w:rPr>
-              <w:t>3.small</w:t>
-            </w:r>
-            <w:proofErr w:type="gramEnd"/>
+              <w:t>t3.small</w:t>
+            </w:r>
           </w:p>
         </w:tc>
       </w:tr>
@@ -7622,23 +7094,7 @@
                 <w:sz w:val="19"/>
                 <w:szCs w:val="19"/>
               </w:rPr>
-              <w:t>smart-</w:t>
-            </w:r>
-            <w:proofErr w:type="gramStart"/>
-            <w:r>
-              <w:rPr>
-                <w:sz w:val="19"/>
-                <w:szCs w:val="19"/>
-              </w:rPr>
-              <w:t>telemetry:v</w:t>
-            </w:r>
-            <w:proofErr w:type="gramEnd"/>
-            <w:r>
-              <w:rPr>
-                <w:sz w:val="19"/>
-                <w:szCs w:val="19"/>
-              </w:rPr>
-              <w:t>1 (124 MB)</w:t>
+              <w:t>smart-telemetry:v1 (124 MB)</w:t>
             </w:r>
           </w:p>
         </w:tc>
@@ -7734,14 +7190,11 @@
         <w:jc w:val="center"/>
       </w:pPr>
       <w:r>
-        <w:rPr>
-          <w:noProof/>
-        </w:rPr>
         <w:drawing>
-          <wp:inline distT="0" distB="0" distL="0" distR="0" wp14:anchorId="44D58C49" wp14:editId="4F73B5F1">
-            <wp:extent cx="5943600" cy="3009900"/>
+          <wp:inline distT="0" distB="0" distL="0" distR="0" wp14:anchorId="1DBB743F" wp14:editId="2C8E7EFB">
+            <wp:extent cx="5943600" cy="3013710"/>
             <wp:effectExtent l="0" t="0" r="0" b="0"/>
-            <wp:docPr id="125981151" name="Imagen 125981151"/>
+            <wp:docPr id="1504658218" name="Imagen 1"/>
             <wp:cNvGraphicFramePr>
               <a:graphicFrameLocks xmlns:a="http://schemas.openxmlformats.org/drawingml/2006/main" noChangeAspect="1"/>
             </wp:cNvGraphicFramePr>
@@ -7749,22 +7202,19 @@
               <a:graphicData uri="http://schemas.openxmlformats.org/drawingml/2006/picture">
                 <pic:pic xmlns:pic="http://schemas.openxmlformats.org/drawingml/2006/picture">
                   <pic:nvPicPr>
-                    <pic:cNvPr id="0" name=""/>
-                    <pic:cNvPicPr>
-                      <a:picLocks noChangeAspect="1" noChangeArrowheads="1"/>
-                    </pic:cNvPicPr>
+                    <pic:cNvPr id="1504658218" name=""/>
+                    <pic:cNvPicPr/>
                   </pic:nvPicPr>
                   <pic:blipFill>
                     <a:blip r:embed="rId8"/>
-                    <a:srcRect/>
                     <a:stretch>
                       <a:fillRect/>
                     </a:stretch>
                   </pic:blipFill>
-                  <pic:spPr bwMode="auto">
+                  <pic:spPr>
                     <a:xfrm>
                       <a:off x="0" y="0"/>
-                      <a:ext cx="5943600" cy="3009900"/>
+                      <a:ext cx="5943600" cy="3013710"/>
                     </a:xfrm>
                     <a:prstGeom prst="rect">
                       <a:avLst/>
@@ -7869,14 +7319,11 @@
         <w:jc w:val="center"/>
       </w:pPr>
       <w:r>
-        <w:rPr>
-          <w:noProof/>
-        </w:rPr>
         <w:drawing>
-          <wp:inline distT="0" distB="0" distL="0" distR="0" wp14:anchorId="2517CE32" wp14:editId="1D4E205E">
-            <wp:extent cx="5943600" cy="3009900"/>
-            <wp:effectExtent l="0" t="0" r="0" b="0"/>
-            <wp:docPr id="530120972" name="Imagen 530120972"/>
+          <wp:inline distT="0" distB="0" distL="0" distR="0" wp14:anchorId="5516444E" wp14:editId="44AA862B">
+            <wp:extent cx="5943600" cy="3007995"/>
+            <wp:effectExtent l="0" t="0" r="0" b="1905"/>
+            <wp:docPr id="1618665852" name="Imagen 1"/>
             <wp:cNvGraphicFramePr>
               <a:graphicFrameLocks xmlns:a="http://schemas.openxmlformats.org/drawingml/2006/main" noChangeAspect="1"/>
             </wp:cNvGraphicFramePr>
@@ -7884,22 +7331,19 @@
               <a:graphicData uri="http://schemas.openxmlformats.org/drawingml/2006/picture">
                 <pic:pic xmlns:pic="http://schemas.openxmlformats.org/drawingml/2006/picture">
                   <pic:nvPicPr>
-                    <pic:cNvPr id="0" name=""/>
-                    <pic:cNvPicPr>
-                      <a:picLocks noChangeAspect="1" noChangeArrowheads="1"/>
-                    </pic:cNvPicPr>
+                    <pic:cNvPr id="1618665852" name=""/>
+                    <pic:cNvPicPr/>
                   </pic:nvPicPr>
                   <pic:blipFill>
                     <a:blip r:embed="rId9"/>
-                    <a:srcRect/>
                     <a:stretch>
                       <a:fillRect/>
                     </a:stretch>
                   </pic:blipFill>
-                  <pic:spPr bwMode="auto">
+                  <pic:spPr>
                     <a:xfrm>
                       <a:off x="0" y="0"/>
-                      <a:ext cx="5943600" cy="3009900"/>
+                      <a:ext cx="5943600" cy="3007995"/>
                     </a:xfrm>
                     <a:prstGeom prst="rect">
                       <a:avLst/>
@@ -7980,7 +7424,6 @@
           <w:lang w:val="en-US"/>
         </w:rPr>
       </w:pPr>
-      <w:proofErr w:type="spellStart"/>
       <w:r>
         <w:rPr>
           <w:rFonts w:ascii="Consolas" w:eastAsia="Consolas" w:hAnsi="Consolas" w:cs="Consolas"/>
@@ -7988,9 +7431,17 @@
           <w:szCs w:val="18"/>
           <w:lang w:val="en-US"/>
         </w:rPr>
-        <w:t>sudo</w:t>
-      </w:r>
-      <w:proofErr w:type="spellEnd"/>
+        <w:t>sudo docker build -t smart-telemetry:v1 .</w:t>
+      </w:r>
+    </w:p>
+    <w:p>
+      <w:pPr>
+        <w:shd w:val="clear" w:color="auto" w:fill="F2F2F2"/>
+        <w:ind w:left="360"/>
+        <w:rPr>
+          <w:lang w:val="en-US"/>
+        </w:rPr>
+      </w:pPr>
       <w:r>
         <w:rPr>
           <w:rFonts w:ascii="Consolas" w:eastAsia="Consolas" w:hAnsi="Consolas" w:cs="Consolas"/>
@@ -7998,67 +7449,7 @@
           <w:szCs w:val="18"/>
           <w:lang w:val="en-US"/>
         </w:rPr>
-        <w:t xml:space="preserve"> docker build -t smart-</w:t>
-      </w:r>
-      <w:proofErr w:type="gramStart"/>
-      <w:r>
-        <w:rPr>
-          <w:rFonts w:ascii="Consolas" w:eastAsia="Consolas" w:hAnsi="Consolas" w:cs="Consolas"/>
-          <w:sz w:val="18"/>
-          <w:szCs w:val="18"/>
-          <w:lang w:val="en-US"/>
-        </w:rPr>
-        <w:t>telemetry:v1 .</w:t>
-      </w:r>
-      <w:proofErr w:type="gramEnd"/>
-    </w:p>
-    <w:p>
-      <w:pPr>
-        <w:shd w:val="clear" w:color="auto" w:fill="F2F2F2"/>
-        <w:ind w:left="360"/>
-        <w:rPr>
-          <w:lang w:val="en-US"/>
-        </w:rPr>
-      </w:pPr>
-      <w:proofErr w:type="spellStart"/>
-      <w:r>
-        <w:rPr>
-          <w:rFonts w:ascii="Consolas" w:eastAsia="Consolas" w:hAnsi="Consolas" w:cs="Consolas"/>
-          <w:sz w:val="18"/>
-          <w:szCs w:val="18"/>
-          <w:lang w:val="en-US"/>
-        </w:rPr>
-        <w:t>sudo</w:t>
-      </w:r>
-      <w:proofErr w:type="spellEnd"/>
-      <w:r>
-        <w:rPr>
-          <w:rFonts w:ascii="Consolas" w:eastAsia="Consolas" w:hAnsi="Consolas" w:cs="Consolas"/>
-          <w:sz w:val="18"/>
-          <w:szCs w:val="18"/>
-          <w:lang w:val="en-US"/>
-        </w:rPr>
-        <w:t xml:space="preserve"> docker </w:t>
-      </w:r>
-      <w:proofErr w:type="gramStart"/>
-      <w:r>
-        <w:rPr>
-          <w:rFonts w:ascii="Consolas" w:eastAsia="Consolas" w:hAnsi="Consolas" w:cs="Consolas"/>
-          <w:sz w:val="18"/>
-          <w:szCs w:val="18"/>
-          <w:lang w:val="en-US"/>
-        </w:rPr>
-        <w:t>run -d --</w:t>
-      </w:r>
-      <w:proofErr w:type="gramEnd"/>
-      <w:r>
-        <w:rPr>
-          <w:rFonts w:ascii="Consolas" w:eastAsia="Consolas" w:hAnsi="Consolas" w:cs="Consolas"/>
-          <w:sz w:val="18"/>
-          <w:szCs w:val="18"/>
-          <w:lang w:val="en-US"/>
-        </w:rPr>
-        <w:t>name smart-telemetry --restart unless-stopped \</w:t>
+        <w:t>sudo docker run -d --name smart-telemetry --restart unless-stopped \</w:t>
       </w:r>
     </w:p>
     <w:p>
@@ -8094,67 +7485,7 @@
           <w:szCs w:val="18"/>
           <w:lang w:val="en-US"/>
         </w:rPr>
-        <w:t xml:space="preserve">  -p 5000:5000/</w:t>
-      </w:r>
-      <w:proofErr w:type="spellStart"/>
-      <w:r>
-        <w:rPr>
-          <w:rFonts w:ascii="Consolas" w:eastAsia="Consolas" w:hAnsi="Consolas" w:cs="Consolas"/>
-          <w:sz w:val="18"/>
-          <w:szCs w:val="18"/>
-          <w:lang w:val="en-US"/>
-        </w:rPr>
-        <w:t>udp</w:t>
-      </w:r>
-      <w:proofErr w:type="spellEnd"/>
-      <w:r>
-        <w:rPr>
-          <w:rFonts w:ascii="Consolas" w:eastAsia="Consolas" w:hAnsi="Consolas" w:cs="Consolas"/>
-          <w:sz w:val="18"/>
-          <w:szCs w:val="18"/>
-          <w:lang w:val="en-US"/>
-        </w:rPr>
-        <w:t xml:space="preserve"> -p 5001:5001/</w:t>
-      </w:r>
-      <w:proofErr w:type="spellStart"/>
-      <w:r>
-        <w:rPr>
-          <w:rFonts w:ascii="Consolas" w:eastAsia="Consolas" w:hAnsi="Consolas" w:cs="Consolas"/>
-          <w:sz w:val="18"/>
-          <w:szCs w:val="18"/>
-          <w:lang w:val="en-US"/>
-        </w:rPr>
-        <w:t>tcp</w:t>
-      </w:r>
-      <w:proofErr w:type="spellEnd"/>
-      <w:r>
-        <w:rPr>
-          <w:rFonts w:ascii="Consolas" w:eastAsia="Consolas" w:hAnsi="Consolas" w:cs="Consolas"/>
-          <w:sz w:val="18"/>
-          <w:szCs w:val="18"/>
-          <w:lang w:val="en-US"/>
-        </w:rPr>
-        <w:t xml:space="preserve"> -p 8080:8080/</w:t>
-      </w:r>
-      <w:proofErr w:type="spellStart"/>
-      <w:r>
-        <w:rPr>
-          <w:rFonts w:ascii="Consolas" w:eastAsia="Consolas" w:hAnsi="Consolas" w:cs="Consolas"/>
-          <w:sz w:val="18"/>
-          <w:szCs w:val="18"/>
-          <w:lang w:val="en-US"/>
-        </w:rPr>
-        <w:t>tcp</w:t>
-      </w:r>
-      <w:proofErr w:type="spellEnd"/>
-      <w:r>
-        <w:rPr>
-          <w:rFonts w:ascii="Consolas" w:eastAsia="Consolas" w:hAnsi="Consolas" w:cs="Consolas"/>
-          <w:sz w:val="18"/>
-          <w:szCs w:val="18"/>
-          <w:lang w:val="en-US"/>
-        </w:rPr>
-        <w:t xml:space="preserve"> \</w:t>
+        <w:t xml:space="preserve">  -p 5000:5000/udp -p 5001:5001/tcp -p 8080:8080/tcp \</w:t>
       </w:r>
     </w:p>
     <w:p>
@@ -8178,25 +7509,7 @@
           <w:sz w:val="18"/>
           <w:szCs w:val="18"/>
         </w:rPr>
-        <w:t>smart-</w:t>
-      </w:r>
-      <w:proofErr w:type="gramStart"/>
-      <w:r>
-        <w:rPr>
-          <w:rFonts w:ascii="Consolas" w:eastAsia="Consolas" w:hAnsi="Consolas" w:cs="Consolas"/>
-          <w:sz w:val="18"/>
-          <w:szCs w:val="18"/>
-        </w:rPr>
-        <w:t>telemetry:v</w:t>
-      </w:r>
-      <w:proofErr w:type="gramEnd"/>
-      <w:r>
-        <w:rPr>
-          <w:rFonts w:ascii="Consolas" w:eastAsia="Consolas" w:hAnsi="Consolas" w:cs="Consolas"/>
-          <w:sz w:val="18"/>
-          <w:szCs w:val="18"/>
-        </w:rPr>
-        <w:t>1</w:t>
+        <w:t>smart-telemetry:v1</w:t>
       </w:r>
     </w:p>
     <w:p>
@@ -8250,15 +7563,7 @@
         <w:jc w:val="both"/>
       </w:pPr>
       <w:r>
-        <w:t xml:space="preserve">La captura se realizó desde un equipo con Windows conectado a Internet por </w:t>
-      </w:r>
-      <w:proofErr w:type="spellStart"/>
-      <w:r>
-        <w:t>Wi</w:t>
-      </w:r>
-      <w:proofErr w:type="spellEnd"/>
-      <w:r>
-        <w:t>-Fi, mientras el servidor se ejecutaba dentro del contenedor en la instancia EC2. La interfaz seleccionada fue el adaptador físico, no una interfaz virtual ni el bucle local, de modo que todos los paquetes registrados atravesaron efectivamente Internet.</w:t>
+        <w:t>La captura se realizó desde un equipo con Windows conectado a Internet por Wi-Fi, mientras el servidor se ejecutaba dentro del contenedor en la instancia EC2. La interfaz seleccionada fue el adaptador físico, no una interfaz virtual ni el bucle local, de modo que todos los paquetes registrados atravesaron efectivamente Internet.</w:t>
       </w:r>
     </w:p>
     <w:p>
@@ -8276,23 +7581,7 @@
         <w:jc w:val="both"/>
       </w:pPr>
       <w:r>
-        <w:t xml:space="preserve">El equipo cliente aparece con la dirección privada 192.168.1.57, asignada por el </w:t>
-      </w:r>
-      <w:proofErr w:type="spellStart"/>
-      <w:r>
-        <w:t>router</w:t>
-      </w:r>
-      <w:proofErr w:type="spellEnd"/>
-      <w:r>
-        <w:t xml:space="preserve"> de la red local, y el servidor con la dirección pública 3.236.83.176. Conviene advertir que el servidor en AWS registra las peticiones procedentes de la dirección pública 181.132.86.197, distinta de la que observa Wireshark. La discrepancia no es un error: el </w:t>
-      </w:r>
-      <w:proofErr w:type="spellStart"/>
-      <w:r>
-        <w:t>router</w:t>
-      </w:r>
-      <w:proofErr w:type="spellEnd"/>
-      <w:r>
-        <w:t xml:space="preserve"> aplica traducción de direcciones después de que el paquete abandona la tarjeta de red, por lo que la captura local solo puede observar el direccionamiento previo a esa traducción. Es una manifestación directa del comportamiento de la capa de red en un escenario real.</w:t>
+        <w:t>El equipo cliente aparece con la dirección privada 192.168.1.57, asignada por el router de la red local, y el servidor con la dirección pública 3.236.83.176. Conviene advertir que el servidor en AWS registra las peticiones procedentes de la dirección pública 181.132.86.197, distinta de la que observa Wireshark. La discrepancia no es un error: el router aplica traducción de direcciones después de que el paquete abandona la tarjeta de red, por lo que la captura local solo puede observar el direccionamiento previo a esa traducción. Es una manifestación directa del comportamiento de la capa de red en un escenario real.</w:t>
       </w:r>
     </w:p>
     <w:p>
@@ -8319,17 +7608,7 @@
         <w:jc w:val="both"/>
       </w:pPr>
       <w:r>
-        <w:t xml:space="preserve">El filtro </w:t>
-      </w:r>
-      <w:proofErr w:type="spellStart"/>
-      <w:proofErr w:type="gramStart"/>
-      <w:r>
-        <w:t>udp.port</w:t>
-      </w:r>
-      <w:proofErr w:type="spellEnd"/>
-      <w:proofErr w:type="gramEnd"/>
-      <w:r>
-        <w:t xml:space="preserve"> == 5000 aísla los 90 datagramas de telemetría registrados, el 15,9 % del total. Esa cifra concuerda con el comportamiento esperado: cinco nodos emitiendo una medición cada cinco segundos durante noventa producen exactamente noventa datagramas.</w:t>
+        <w:t>El filtro udp.port == 5000 aísla los 90 datagramas de telemetría registrados, el 15,9 % del total. Esa cifra concuerda con el comportamiento esperado: cinco nodos emitiendo una medición cada cinco segundos durante noventa producen exactamente noventa datagramas.</w:t>
       </w:r>
     </w:p>
     <w:p>
@@ -8455,17 +7734,7 @@
         <w:jc w:val="both"/>
       </w:pPr>
       <w:r>
-        <w:t xml:space="preserve">El filtro </w:t>
-      </w:r>
-      <w:proofErr w:type="spellStart"/>
-      <w:proofErr w:type="gramStart"/>
-      <w:r>
-        <w:t>tcp.stream</w:t>
-      </w:r>
-      <w:proofErr w:type="spellEnd"/>
-      <w:proofErr w:type="gramEnd"/>
-      <w:r>
-        <w:t xml:space="preserve"> == 1 aísla una única conversación contra el puerto 5001. La Figura 5 muestra el intercambio completo en diez paquetes.</w:t>
+        <w:t>El filtro tcp.stream == 1 aísla una única conversación contra el puerto 5001. La Figura 5 muestra el intercambio completo en diez paquetes.</w:t>
       </w:r>
     </w:p>
     <w:p>
@@ -9463,15 +8732,7 @@
         <w:jc w:val="both"/>
       </w:pPr>
       <w:r>
-        <w:t xml:space="preserve">La captura registra una sola conversación a nivel de red, consecuencia del filtro aplicado. El cliente emite 310 paquetes con 40 kB, y el servidor 257 paquetes con 97 kB. El tráfico resulta marcadamente asimétrico, y en sentido inverso al que podría suponerse: el cliente emite más paquetes, porque los cinco nodos generan un flujo constante de datagramas, pero transfiere menos de la mitad de los bytes, dado que cada medición ocupa apenas 60 bytes. El servidor emite menos </w:t>
-      </w:r>
-      <w:proofErr w:type="gramStart"/>
-      <w:r>
-        <w:t>paquetes</w:t>
-      </w:r>
-      <w:proofErr w:type="gramEnd"/>
-      <w:r>
-        <w:t xml:space="preserve"> pero transporta más del doble de información, porque sus respuestas incluyen páginas HTML completas y listados de cien alertas.</w:t>
+        <w:t>La captura registra una sola conversación a nivel de red, consecuencia del filtro aplicado. El cliente emite 310 paquetes con 40 kB, y el servidor 257 paquetes con 97 kB. El tráfico resulta marcadamente asimétrico, y en sentido inverso al que podría suponerse: el cliente emite más paquetes, porque los cinco nodos generan un flujo constante de datagramas, pero transfiere menos de la mitad de los bytes, dado que cada medición ocupa apenas 60 bytes. El servidor emite menos paquetes pero transporta más del doble de información, porque sus respuestas incluyen páginas HTML completas y listados de cien alertas.</w:t>
       </w:r>
     </w:p>
     <w:p>
@@ -9902,23 +9163,7 @@
                 <w:sz w:val="19"/>
                 <w:szCs w:val="19"/>
               </w:rPr>
-              <w:t>Finalizada; imagen smart-</w:t>
-            </w:r>
-            <w:proofErr w:type="gramStart"/>
-            <w:r>
-              <w:rPr>
-                <w:sz w:val="19"/>
-                <w:szCs w:val="19"/>
-              </w:rPr>
-              <w:t>telemetry:v</w:t>
-            </w:r>
-            <w:proofErr w:type="gramEnd"/>
-            <w:r>
-              <w:rPr>
-                <w:sz w:val="19"/>
-                <w:szCs w:val="19"/>
-              </w:rPr>
-              <w:t>1 disponible</w:t>
+              <w:t>Finalizada; imagen smart-telemetry:v1 disponible</w:t>
             </w:r>
           </w:p>
         </w:tc>
@@ -10543,23 +9788,7 @@
                 <w:sz w:val="19"/>
                 <w:szCs w:val="19"/>
               </w:rPr>
-              <w:t>Se generó DEMO_</w:t>
-            </w:r>
-            <w:proofErr w:type="gramStart"/>
-            <w:r>
-              <w:rPr>
-                <w:sz w:val="19"/>
-                <w:szCs w:val="19"/>
-              </w:rPr>
-              <w:t>ALERT,TEMP</w:t>
-            </w:r>
-            <w:proofErr w:type="gramEnd"/>
-            <w:r>
-              <w:rPr>
-                <w:sz w:val="19"/>
-                <w:szCs w:val="19"/>
-              </w:rPr>
-              <w:t>_HIGH,45.00</w:t>
+              <w:t>Se generó DEMO_ALERT,TEMP_HIGH,45.00</w:t>
             </w:r>
           </w:p>
         </w:tc>
@@ -11177,23 +10406,7 @@
         <w:jc w:val="both"/>
       </w:pPr>
       <w:r>
-        <w:t xml:space="preserve">Aporte: captura y análisis de tráfico de red con Wireshark, documentado en la sección 7. Equipo JUANJOSEDIAZ, usuario </w:t>
-      </w:r>
-      <w:proofErr w:type="spellStart"/>
-      <w:r>
-        <w:t>juanjosediaz</w:t>
-      </w:r>
-      <w:proofErr w:type="spellEnd"/>
-      <w:r>
-        <w:t>\</w:t>
-      </w:r>
-      <w:proofErr w:type="spellStart"/>
-      <w:r>
-        <w:t>jjdia</w:t>
-      </w:r>
-      <w:proofErr w:type="spellEnd"/>
-      <w:r>
-        <w:t>.</w:t>
+        <w:t>Aporte: captura y análisis de tráfico de red con Wireshark, documentado en la sección 7. Equipo JUANJOSEDIAZ, usuario juanjosediaz\jjdia.</w:t>
       </w:r>
     </w:p>
     <w:p>
@@ -11264,23 +10477,7 @@
           <w:sz w:val="19"/>
           <w:szCs w:val="19"/>
         </w:rPr>
-        <w:t xml:space="preserve">Ejecución de los cinco nodos de telemetría contra el servidor desplegado. Se identifican el usuario, el </w:t>
-      </w:r>
-      <w:proofErr w:type="spellStart"/>
-      <w:r>
-        <w:rPr>
-          <w:sz w:val="19"/>
-          <w:szCs w:val="19"/>
-        </w:rPr>
-        <w:t>hostname</w:t>
-      </w:r>
-      <w:proofErr w:type="spellEnd"/>
-      <w:r>
-        <w:rPr>
-          <w:sz w:val="19"/>
-          <w:szCs w:val="19"/>
-        </w:rPr>
-        <w:t>, la fecha, el entorno de desarrollo y la resolución DNS del nombre de la instancia.</w:t>
+        <w:t>Ejecución de los cinco nodos de telemetría contra el servidor desplegado. Se identifican el usuario, el hostname, la fecha, el entorno de desarrollo y la resolución DNS del nombre de la instancia.</w:t>
       </w:r>
     </w:p>
     <w:p>
@@ -11401,35 +10598,660 @@
     </w:p>
     <w:p>
       <w:pPr>
-        <w:spacing w:after="160" w:line="276" w:lineRule="auto"/>
-        <w:jc w:val="both"/>
-      </w:pPr>
-      <w:r>
-        <w:rPr>
-          <w:i/>
-          <w:iCs/>
-          <w:color w:val="999999"/>
-        </w:rPr>
+        <w:spacing w:after="60" w:line="276" w:lineRule="auto"/>
+        <w:jc w:val="both"/>
+      </w:pPr>
+    </w:p>
+    <w:p>
+      <w:pPr>
+        <w:spacing w:after="60" w:line="276" w:lineRule="auto"/>
+        <w:jc w:val="both"/>
+      </w:pPr>
+      <w:r>
         <w:lastRenderedPageBreak/>
-        <w:t xml:space="preserve">[Pendiente: insertar aquí las capturas de pantalla tomadas en su equipo, mostrando usuario, </w:t>
-      </w:r>
-      <w:proofErr w:type="spellStart"/>
-      <w:r>
-        <w:rPr>
-          <w:i/>
-          <w:iCs/>
-          <w:color w:val="999999"/>
-        </w:rPr>
-        <w:t>hostname</w:t>
-      </w:r>
-      <w:proofErr w:type="spellEnd"/>
-      <w:r>
-        <w:rPr>
-          <w:i/>
-          <w:iCs/>
-          <w:color w:val="999999"/>
-        </w:rPr>
-        <w:t xml:space="preserve"> y fecha en la misma terminal donde se ejecute un componente del proyecto o se conecte a la instancia desplegada.]</w:t>
+        <w:t>Se verifica que la instancia smart-telemetry-server se encuentra en estado Running, con las comprobaciones de estado correctas y una dirección IP pública asignada.</w:t>
+      </w:r>
+    </w:p>
+    <w:p>
+      <w:pPr>
+        <w:spacing w:after="60" w:line="276" w:lineRule="auto"/>
+        <w:jc w:val="both"/>
+      </w:pPr>
+      <w:r>
+        <w:drawing>
+          <wp:inline distT="0" distB="0" distL="0" distR="0" wp14:anchorId="2D6D4B48" wp14:editId="31A22D3F">
+            <wp:extent cx="5943600" cy="3014345"/>
+            <wp:effectExtent l="0" t="0" r="0" b="0"/>
+            <wp:docPr id="123205408" name="Imagen 2"/>
+            <wp:cNvGraphicFramePr>
+              <a:graphicFrameLocks xmlns:a="http://schemas.openxmlformats.org/drawingml/2006/main" noChangeAspect="1"/>
+            </wp:cNvGraphicFramePr>
+            <a:graphic xmlns:a="http://schemas.openxmlformats.org/drawingml/2006/main">
+              <a:graphicData uri="http://schemas.openxmlformats.org/drawingml/2006/picture">
+                <pic:pic xmlns:pic="http://schemas.openxmlformats.org/drawingml/2006/picture">
+                  <pic:nvPicPr>
+                    <pic:cNvPr id="0" name="Picture 6"/>
+                    <pic:cNvPicPr>
+                      <a:picLocks noChangeAspect="1" noChangeArrowheads="1"/>
+                    </pic:cNvPicPr>
+                  </pic:nvPicPr>
+                  <pic:blipFill>
+                    <a:blip r:embed="rId18" cstate="print">
+                      <a:extLst>
+                        <a:ext uri="{28A0092B-C50C-407E-A947-70E740481C1C}">
+                          <a14:useLocalDpi xmlns:a14="http://schemas.microsoft.com/office/drawing/2010/main" val="0"/>
+                        </a:ext>
+                      </a:extLst>
+                    </a:blip>
+                    <a:srcRect/>
+                    <a:stretch>
+                      <a:fillRect/>
+                    </a:stretch>
+                  </pic:blipFill>
+                  <pic:spPr bwMode="auto">
+                    <a:xfrm>
+                      <a:off x="0" y="0"/>
+                      <a:ext cx="5943600" cy="3014345"/>
+                    </a:xfrm>
+                    <a:prstGeom prst="rect">
+                      <a:avLst/>
+                    </a:prstGeom>
+                    <a:noFill/>
+                    <a:ln>
+                      <a:noFill/>
+                    </a:ln>
+                  </pic:spPr>
+                </pic:pic>
+              </a:graphicData>
+            </a:graphic>
+          </wp:inline>
+        </w:drawing>
+      </w:r>
+    </w:p>
+    <w:p>
+      <w:pPr>
+        <w:spacing w:after="60" w:line="276" w:lineRule="auto"/>
+        <w:jc w:val="both"/>
+      </w:pPr>
+    </w:p>
+    <w:p>
+      <w:pPr>
+        <w:spacing w:after="60" w:line="276" w:lineRule="auto"/>
+        <w:jc w:val="both"/>
+      </w:pPr>
+      <w:r>
+        <w:t>Se evidencian las reglas de entrada que permiten el acceso SSH (22/TCP), la recepción de telemetría (5000/UDP), las consultas de operadores (5001/TCP) y el acceso al panel web (8080/TCP).</w:t>
+      </w:r>
+    </w:p>
+    <w:p>
+      <w:pPr>
+        <w:spacing w:after="60" w:line="276" w:lineRule="auto"/>
+        <w:jc w:val="both"/>
+      </w:pPr>
+      <w:r>
+        <w:drawing>
+          <wp:inline distT="0" distB="0" distL="0" distR="0" wp14:anchorId="49D49D9B" wp14:editId="7A4EFAF0">
+            <wp:extent cx="5943600" cy="3007995"/>
+            <wp:effectExtent l="0" t="0" r="0" b="1905"/>
+            <wp:docPr id="361729885" name="Imagen 1"/>
+            <wp:cNvGraphicFramePr>
+              <a:graphicFrameLocks xmlns:a="http://schemas.openxmlformats.org/drawingml/2006/main" noChangeAspect="1"/>
+            </wp:cNvGraphicFramePr>
+            <a:graphic xmlns:a="http://schemas.openxmlformats.org/drawingml/2006/main">
+              <a:graphicData uri="http://schemas.openxmlformats.org/drawingml/2006/picture">
+                <pic:pic xmlns:pic="http://schemas.openxmlformats.org/drawingml/2006/picture">
+                  <pic:nvPicPr>
+                    <pic:cNvPr id="361729885" name=""/>
+                    <pic:cNvPicPr/>
+                  </pic:nvPicPr>
+                  <pic:blipFill>
+                    <a:blip r:embed="rId9"/>
+                    <a:stretch>
+                      <a:fillRect/>
+                    </a:stretch>
+                  </pic:blipFill>
+                  <pic:spPr>
+                    <a:xfrm>
+                      <a:off x="0" y="0"/>
+                      <a:ext cx="5943600" cy="3007995"/>
+                    </a:xfrm>
+                    <a:prstGeom prst="rect">
+                      <a:avLst/>
+                    </a:prstGeom>
+                  </pic:spPr>
+                </pic:pic>
+              </a:graphicData>
+            </a:graphic>
+          </wp:inline>
+        </w:drawing>
+      </w:r>
+    </w:p>
+    <w:p>
+      <w:pPr>
+        <w:spacing w:after="60" w:line="276" w:lineRule="auto"/>
+        <w:jc w:val="both"/>
+      </w:pPr>
+    </w:p>
+    <w:p>
+      <w:pPr>
+        <w:spacing w:after="60" w:line="276" w:lineRule="auto"/>
+        <w:jc w:val="both"/>
+      </w:pPr>
+    </w:p>
+    <w:p>
+      <w:pPr>
+        <w:spacing w:after="60" w:line="276" w:lineRule="auto"/>
+        <w:jc w:val="both"/>
+      </w:pPr>
+    </w:p>
+    <w:p>
+      <w:pPr>
+        <w:spacing w:after="60" w:line="276" w:lineRule="auto"/>
+        <w:jc w:val="both"/>
+      </w:pPr>
+    </w:p>
+    <w:p>
+      <w:pPr>
+        <w:spacing w:after="60" w:line="276" w:lineRule="auto"/>
+        <w:jc w:val="both"/>
+      </w:pPr>
+      <w:r>
+        <w:lastRenderedPageBreak/>
+        <w:t>Se demuestra el acceso remoto exitoso a la instancia EC2 mediante SSH, verificando el usuario, el nombre del servidor, la fecha y el sistema operativo Amazon Linux 2023.</w:t>
+      </w:r>
+    </w:p>
+    <w:p>
+      <w:pPr>
+        <w:spacing w:after="60" w:line="276" w:lineRule="auto"/>
+        <w:jc w:val="both"/>
+      </w:pPr>
+      <w:r>
+        <w:drawing>
+          <wp:inline distT="0" distB="0" distL="0" distR="0" wp14:anchorId="0B773E17" wp14:editId="38854B89">
+            <wp:extent cx="5943600" cy="3145790"/>
+            <wp:effectExtent l="0" t="0" r="0" b="0"/>
+            <wp:docPr id="299440403" name="Imagen 1"/>
+            <wp:cNvGraphicFramePr>
+              <a:graphicFrameLocks xmlns:a="http://schemas.openxmlformats.org/drawingml/2006/main" noChangeAspect="1"/>
+            </wp:cNvGraphicFramePr>
+            <a:graphic xmlns:a="http://schemas.openxmlformats.org/drawingml/2006/main">
+              <a:graphicData uri="http://schemas.openxmlformats.org/drawingml/2006/picture">
+                <pic:pic xmlns:pic="http://schemas.openxmlformats.org/drawingml/2006/picture">
+                  <pic:nvPicPr>
+                    <pic:cNvPr id="299440403" name=""/>
+                    <pic:cNvPicPr/>
+                  </pic:nvPicPr>
+                  <pic:blipFill>
+                    <a:blip r:embed="rId19"/>
+                    <a:stretch>
+                      <a:fillRect/>
+                    </a:stretch>
+                  </pic:blipFill>
+                  <pic:spPr>
+                    <a:xfrm>
+                      <a:off x="0" y="0"/>
+                      <a:ext cx="5943600" cy="3145790"/>
+                    </a:xfrm>
+                    <a:prstGeom prst="rect">
+                      <a:avLst/>
+                    </a:prstGeom>
+                  </pic:spPr>
+                </pic:pic>
+              </a:graphicData>
+            </a:graphic>
+          </wp:inline>
+        </w:drawing>
+      </w:r>
+    </w:p>
+    <w:p>
+      <w:pPr>
+        <w:spacing w:after="60" w:line="276" w:lineRule="auto"/>
+        <w:jc w:val="both"/>
+      </w:pPr>
+    </w:p>
+    <w:p>
+      <w:pPr>
+        <w:spacing w:after="60" w:line="276" w:lineRule="auto"/>
+        <w:jc w:val="both"/>
+      </w:pPr>
+      <w:r>
+        <w:t>El comando docker ps confirma que el contenedor smart-telemetry se encuentra activo y tiene publicados los puertos 5000/UDP, 5001/TCP y 8080/TCP.</w:t>
+      </w:r>
+    </w:p>
+    <w:p>
+      <w:pPr>
+        <w:spacing w:after="60" w:line="276" w:lineRule="auto"/>
+        <w:jc w:val="both"/>
+      </w:pPr>
+      <w:r>
+        <w:drawing>
+          <wp:inline distT="0" distB="0" distL="0" distR="0" wp14:anchorId="6B5F24C1" wp14:editId="2B4D0CF0">
+            <wp:extent cx="5943600" cy="3026410"/>
+            <wp:effectExtent l="0" t="0" r="0" b="2540"/>
+            <wp:docPr id="962036291" name="Imagen 1"/>
+            <wp:cNvGraphicFramePr>
+              <a:graphicFrameLocks xmlns:a="http://schemas.openxmlformats.org/drawingml/2006/main" noChangeAspect="1"/>
+            </wp:cNvGraphicFramePr>
+            <a:graphic xmlns:a="http://schemas.openxmlformats.org/drawingml/2006/main">
+              <a:graphicData uri="http://schemas.openxmlformats.org/drawingml/2006/picture">
+                <pic:pic xmlns:pic="http://schemas.openxmlformats.org/drawingml/2006/picture">
+                  <pic:nvPicPr>
+                    <pic:cNvPr id="962036291" name=""/>
+                    <pic:cNvPicPr/>
+                  </pic:nvPicPr>
+                  <pic:blipFill>
+                    <a:blip r:embed="rId20"/>
+                    <a:stretch>
+                      <a:fillRect/>
+                    </a:stretch>
+                  </pic:blipFill>
+                  <pic:spPr>
+                    <a:xfrm>
+                      <a:off x="0" y="0"/>
+                      <a:ext cx="5943600" cy="3026410"/>
+                    </a:xfrm>
+                    <a:prstGeom prst="rect">
+                      <a:avLst/>
+                    </a:prstGeom>
+                  </pic:spPr>
+                </pic:pic>
+              </a:graphicData>
+            </a:graphic>
+          </wp:inline>
+        </w:drawing>
+      </w:r>
+    </w:p>
+    <w:p>
+      <w:pPr>
+        <w:spacing w:after="60" w:line="276" w:lineRule="auto"/>
+        <w:jc w:val="both"/>
+      </w:pPr>
+    </w:p>
+    <w:p>
+      <w:pPr>
+        <w:spacing w:after="60" w:line="276" w:lineRule="auto"/>
+        <w:jc w:val="both"/>
+      </w:pPr>
+    </w:p>
+    <w:p>
+      <w:pPr>
+        <w:spacing w:after="60" w:line="276" w:lineRule="auto"/>
+        <w:jc w:val="both"/>
+      </w:pPr>
+    </w:p>
+    <w:p>
+      <w:pPr>
+        <w:spacing w:after="60" w:line="276" w:lineRule="auto"/>
+        <w:jc w:val="both"/>
+      </w:pPr>
+      <w:r>
+        <w:lastRenderedPageBreak/>
+        <w:t>Se muestran los registros de Docker, evidenciando la recepción de mensajes UDP, la actualización de los nodos y la generación de alertas.</w:t>
+      </w:r>
+    </w:p>
+    <w:p>
+      <w:pPr>
+        <w:spacing w:after="60" w:line="276" w:lineRule="auto"/>
+        <w:jc w:val="both"/>
+      </w:pPr>
+      <w:r>
+        <w:drawing>
+          <wp:inline distT="0" distB="0" distL="0" distR="0" wp14:anchorId="462F409B" wp14:editId="4F7B58EC">
+            <wp:extent cx="5943600" cy="3160395"/>
+            <wp:effectExtent l="0" t="0" r="0" b="1905"/>
+            <wp:docPr id="543256411" name="Imagen 1"/>
+            <wp:cNvGraphicFramePr>
+              <a:graphicFrameLocks xmlns:a="http://schemas.openxmlformats.org/drawingml/2006/main" noChangeAspect="1"/>
+            </wp:cNvGraphicFramePr>
+            <a:graphic xmlns:a="http://schemas.openxmlformats.org/drawingml/2006/main">
+              <a:graphicData uri="http://schemas.openxmlformats.org/drawingml/2006/picture">
+                <pic:pic xmlns:pic="http://schemas.openxmlformats.org/drawingml/2006/picture">
+                  <pic:nvPicPr>
+                    <pic:cNvPr id="543256411" name=""/>
+                    <pic:cNvPicPr/>
+                  </pic:nvPicPr>
+                  <pic:blipFill>
+                    <a:blip r:embed="rId21"/>
+                    <a:stretch>
+                      <a:fillRect/>
+                    </a:stretch>
+                  </pic:blipFill>
+                  <pic:spPr>
+                    <a:xfrm>
+                      <a:off x="0" y="0"/>
+                      <a:ext cx="5943600" cy="3160395"/>
+                    </a:xfrm>
+                    <a:prstGeom prst="rect">
+                      <a:avLst/>
+                    </a:prstGeom>
+                  </pic:spPr>
+                </pic:pic>
+              </a:graphicData>
+            </a:graphic>
+          </wp:inline>
+        </w:drawing>
+      </w:r>
+    </w:p>
+    <w:p>
+      <w:pPr>
+        <w:spacing w:after="60" w:line="276" w:lineRule="auto"/>
+        <w:jc w:val="both"/>
+      </w:pPr>
+    </w:p>
+    <w:p>
+      <w:pPr>
+        <w:spacing w:after="60" w:line="276" w:lineRule="auto"/>
+        <w:jc w:val="both"/>
+      </w:pPr>
+      <w:r>
+        <w:t>La solicitud HTTP realizada desde EC2 devuelve el código 200 OK, confirmando que el panel web responde correctamente en el puerto 8080.</w:t>
+      </w:r>
+    </w:p>
+    <w:p>
+      <w:pPr>
+        <w:spacing w:after="60" w:line="276" w:lineRule="auto"/>
+        <w:jc w:val="both"/>
+      </w:pPr>
+      <w:r>
+        <w:drawing>
+          <wp:inline distT="0" distB="0" distL="0" distR="0" wp14:anchorId="77333A38" wp14:editId="5A976459">
+            <wp:extent cx="5943600" cy="3162300"/>
+            <wp:effectExtent l="0" t="0" r="0" b="0"/>
+            <wp:docPr id="89509427" name="Imagen 1"/>
+            <wp:cNvGraphicFramePr>
+              <a:graphicFrameLocks xmlns:a="http://schemas.openxmlformats.org/drawingml/2006/main" noChangeAspect="1"/>
+            </wp:cNvGraphicFramePr>
+            <a:graphic xmlns:a="http://schemas.openxmlformats.org/drawingml/2006/main">
+              <a:graphicData uri="http://schemas.openxmlformats.org/drawingml/2006/picture">
+                <pic:pic xmlns:pic="http://schemas.openxmlformats.org/drawingml/2006/picture">
+                  <pic:nvPicPr>
+                    <pic:cNvPr id="89509427" name=""/>
+                    <pic:cNvPicPr/>
+                  </pic:nvPicPr>
+                  <pic:blipFill>
+                    <a:blip r:embed="rId22"/>
+                    <a:stretch>
+                      <a:fillRect/>
+                    </a:stretch>
+                  </pic:blipFill>
+                  <pic:spPr>
+                    <a:xfrm>
+                      <a:off x="0" y="0"/>
+                      <a:ext cx="5943600" cy="3162300"/>
+                    </a:xfrm>
+                    <a:prstGeom prst="rect">
+                      <a:avLst/>
+                    </a:prstGeom>
+                  </pic:spPr>
+                </pic:pic>
+              </a:graphicData>
+            </a:graphic>
+          </wp:inline>
+        </w:drawing>
+      </w:r>
+    </w:p>
+    <w:p>
+      <w:pPr>
+        <w:spacing w:after="60" w:line="276" w:lineRule="auto"/>
+        <w:jc w:val="both"/>
+      </w:pPr>
+    </w:p>
+    <w:p>
+      <w:pPr>
+        <w:spacing w:after="60" w:line="276" w:lineRule="auto"/>
+        <w:jc w:val="both"/>
+      </w:pPr>
+    </w:p>
+    <w:p>
+      <w:pPr>
+        <w:spacing w:after="60" w:line="276" w:lineRule="auto"/>
+        <w:jc w:val="both"/>
+      </w:pPr>
+    </w:p>
+    <w:p>
+      <w:pPr>
+        <w:spacing w:after="60" w:line="276" w:lineRule="auto"/>
+        <w:jc w:val="both"/>
+      </w:pPr>
+      <w:r>
+        <w:lastRenderedPageBreak/>
+        <w:t>Se ejecuta docker restart y se comprueba que el contenedor vuelve al estado Up, conserva los tres puertos publicados y continúa procesando mensajes.</w:t>
+      </w:r>
+    </w:p>
+    <w:p>
+      <w:pPr>
+        <w:spacing w:after="60" w:line="276" w:lineRule="auto"/>
+        <w:jc w:val="both"/>
+      </w:pPr>
+      <w:r>
+        <w:drawing>
+          <wp:inline distT="0" distB="0" distL="0" distR="0" wp14:anchorId="251C52D1" wp14:editId="136AD375">
+            <wp:extent cx="5943600" cy="3153410"/>
+            <wp:effectExtent l="0" t="0" r="0" b="8890"/>
+            <wp:docPr id="1609323048" name="Imagen 1"/>
+            <wp:cNvGraphicFramePr>
+              <a:graphicFrameLocks xmlns:a="http://schemas.openxmlformats.org/drawingml/2006/main" noChangeAspect="1"/>
+            </wp:cNvGraphicFramePr>
+            <a:graphic xmlns:a="http://schemas.openxmlformats.org/drawingml/2006/main">
+              <a:graphicData uri="http://schemas.openxmlformats.org/drawingml/2006/picture">
+                <pic:pic xmlns:pic="http://schemas.openxmlformats.org/drawingml/2006/picture">
+                  <pic:nvPicPr>
+                    <pic:cNvPr id="1609323048" name=""/>
+                    <pic:cNvPicPr/>
+                  </pic:nvPicPr>
+                  <pic:blipFill>
+                    <a:blip r:embed="rId23"/>
+                    <a:stretch>
+                      <a:fillRect/>
+                    </a:stretch>
+                  </pic:blipFill>
+                  <pic:spPr>
+                    <a:xfrm>
+                      <a:off x="0" y="0"/>
+                      <a:ext cx="5943600" cy="3153410"/>
+                    </a:xfrm>
+                    <a:prstGeom prst="rect">
+                      <a:avLst/>
+                    </a:prstGeom>
+                  </pic:spPr>
+                </pic:pic>
+              </a:graphicData>
+            </a:graphic>
+          </wp:inline>
+        </w:drawing>
+      </w:r>
+    </w:p>
+    <w:p>
+      <w:pPr>
+        <w:spacing w:after="60" w:line="276" w:lineRule="auto"/>
+        <w:jc w:val="both"/>
+      </w:pPr>
+    </w:p>
+    <w:p>
+      <w:pPr>
+        <w:spacing w:after="60" w:line="276" w:lineRule="auto"/>
+        <w:jc w:val="both"/>
+      </w:pPr>
+      <w:r>
+        <w:t>Se verifica la comunicación TCP con el servidor mediante consultas del estado general y de los nodos activos, obteniendo respuestas satisfactorias con cinco nodos registrados como activos.</w:t>
+      </w:r>
+    </w:p>
+    <w:p>
+      <w:pPr>
+        <w:spacing w:after="60" w:line="276" w:lineRule="auto"/>
+        <w:jc w:val="both"/>
+      </w:pPr>
+      <w:r>
+        <w:drawing>
+          <wp:inline distT="0" distB="0" distL="0" distR="0" wp14:anchorId="7BD5CA26" wp14:editId="3CE0A32D">
+            <wp:extent cx="5943600" cy="2755900"/>
+            <wp:effectExtent l="0" t="0" r="0" b="6350"/>
+            <wp:docPr id="1076762042" name="Imagen 1"/>
+            <wp:cNvGraphicFramePr>
+              <a:graphicFrameLocks xmlns:a="http://schemas.openxmlformats.org/drawingml/2006/main" noChangeAspect="1"/>
+            </wp:cNvGraphicFramePr>
+            <a:graphic xmlns:a="http://schemas.openxmlformats.org/drawingml/2006/main">
+              <a:graphicData uri="http://schemas.openxmlformats.org/drawingml/2006/picture">
+                <pic:pic xmlns:pic="http://schemas.openxmlformats.org/drawingml/2006/picture">
+                  <pic:nvPicPr>
+                    <pic:cNvPr id="1076762042" name=""/>
+                    <pic:cNvPicPr/>
+                  </pic:nvPicPr>
+                  <pic:blipFill>
+                    <a:blip r:embed="rId24"/>
+                    <a:stretch>
+                      <a:fillRect/>
+                    </a:stretch>
+                  </pic:blipFill>
+                  <pic:spPr>
+                    <a:xfrm>
+                      <a:off x="0" y="0"/>
+                      <a:ext cx="5943600" cy="2755900"/>
+                    </a:xfrm>
+                    <a:prstGeom prst="rect">
+                      <a:avLst/>
+                    </a:prstGeom>
+                  </pic:spPr>
+                </pic:pic>
+              </a:graphicData>
+            </a:graphic>
+          </wp:inline>
+        </w:drawing>
+      </w:r>
+    </w:p>
+    <w:p>
+      <w:pPr>
+        <w:spacing w:after="60" w:line="276" w:lineRule="auto"/>
+        <w:jc w:val="both"/>
+      </w:pPr>
+    </w:p>
+    <w:p>
+      <w:pPr>
+        <w:spacing w:after="60" w:line="276" w:lineRule="auto"/>
+        <w:jc w:val="both"/>
+      </w:pPr>
+    </w:p>
+    <w:p>
+      <w:pPr>
+        <w:spacing w:after="60" w:line="276" w:lineRule="auto"/>
+        <w:jc w:val="both"/>
+      </w:pPr>
+    </w:p>
+    <w:p>
+      <w:pPr>
+        <w:spacing w:after="60" w:line="276" w:lineRule="auto"/>
+        <w:jc w:val="both"/>
+      </w:pPr>
+    </w:p>
+    <w:p>
+      <w:pPr>
+        <w:spacing w:after="60" w:line="276" w:lineRule="auto"/>
+        <w:jc w:val="both"/>
+      </w:pPr>
+      <w:r>
+        <w:lastRenderedPageBreak/>
+        <w:t>Se evidencia la ejecución de los nodos Python, que transmiten periódicamente mediciones al servidor EC2 mediante UDP por el puerto 5000.</w:t>
+      </w:r>
+    </w:p>
+    <w:p>
+      <w:pPr>
+        <w:spacing w:after="60" w:line="276" w:lineRule="auto"/>
+        <w:jc w:val="both"/>
+      </w:pPr>
+      <w:r>
+        <w:drawing>
+          <wp:inline distT="0" distB="0" distL="0" distR="0" wp14:anchorId="1FBB9E9D" wp14:editId="5E003786">
+            <wp:extent cx="5943600" cy="3162300"/>
+            <wp:effectExtent l="0" t="0" r="0" b="0"/>
+            <wp:docPr id="213479201" name="Imagen 1"/>
+            <wp:cNvGraphicFramePr>
+              <a:graphicFrameLocks xmlns:a="http://schemas.openxmlformats.org/drawingml/2006/main" noChangeAspect="1"/>
+            </wp:cNvGraphicFramePr>
+            <a:graphic xmlns:a="http://schemas.openxmlformats.org/drawingml/2006/main">
+              <a:graphicData uri="http://schemas.openxmlformats.org/drawingml/2006/picture">
+                <pic:pic xmlns:pic="http://schemas.openxmlformats.org/drawingml/2006/picture">
+                  <pic:nvPicPr>
+                    <pic:cNvPr id="213479201" name=""/>
+                    <pic:cNvPicPr/>
+                  </pic:nvPicPr>
+                  <pic:blipFill>
+                    <a:blip r:embed="rId25"/>
+                    <a:stretch>
+                      <a:fillRect/>
+                    </a:stretch>
+                  </pic:blipFill>
+                  <pic:spPr>
+                    <a:xfrm>
+                      <a:off x="0" y="0"/>
+                      <a:ext cx="5943600" cy="3162300"/>
+                    </a:xfrm>
+                    <a:prstGeom prst="rect">
+                      <a:avLst/>
+                    </a:prstGeom>
+                  </pic:spPr>
+                </pic:pic>
+              </a:graphicData>
+            </a:graphic>
+          </wp:inline>
+        </w:drawing>
+      </w:r>
+    </w:p>
+    <w:p>
+      <w:pPr>
+        <w:spacing w:after="60" w:line="276" w:lineRule="auto"/>
+        <w:jc w:val="both"/>
+      </w:pPr>
+    </w:p>
+    <w:p>
+      <w:pPr>
+        <w:spacing w:after="60" w:line="276" w:lineRule="auto"/>
+        <w:jc w:val="both"/>
+      </w:pPr>
+      <w:r>
+        <w:t xml:space="preserve">Se transmitieron 100 mensajes y se contabilizaron 105 recepciones, con cero pérdidas estimadas reportadas. </w:t>
+      </w:r>
+    </w:p>
+    <w:p>
+      <w:pPr>
+        <w:spacing w:after="60" w:line="276" w:lineRule="auto"/>
+        <w:jc w:val="both"/>
+      </w:pPr>
+      <w:r>
+        <w:drawing>
+          <wp:inline distT="0" distB="0" distL="0" distR="0" wp14:anchorId="3201F347" wp14:editId="4D7EF3CC">
+            <wp:extent cx="5943600" cy="1038860"/>
+            <wp:effectExtent l="0" t="0" r="0" b="8890"/>
+            <wp:docPr id="1719880958" name="Imagen 1"/>
+            <wp:cNvGraphicFramePr>
+              <a:graphicFrameLocks xmlns:a="http://schemas.openxmlformats.org/drawingml/2006/main" noChangeAspect="1"/>
+            </wp:cNvGraphicFramePr>
+            <a:graphic xmlns:a="http://schemas.openxmlformats.org/drawingml/2006/main">
+              <a:graphicData uri="http://schemas.openxmlformats.org/drawingml/2006/picture">
+                <pic:pic xmlns:pic="http://schemas.openxmlformats.org/drawingml/2006/picture">
+                  <pic:nvPicPr>
+                    <pic:cNvPr id="1719880958" name=""/>
+                    <pic:cNvPicPr/>
+                  </pic:nvPicPr>
+                  <pic:blipFill>
+                    <a:blip r:embed="rId26"/>
+                    <a:stretch>
+                      <a:fillRect/>
+                    </a:stretch>
+                  </pic:blipFill>
+                  <pic:spPr>
+                    <a:xfrm>
+                      <a:off x="0" y="0"/>
+                      <a:ext cx="5943600" cy="1038860"/>
+                    </a:xfrm>
+                    <a:prstGeom prst="rect">
+                      <a:avLst/>
+                    </a:prstGeom>
+                  </pic:spPr>
+                </pic:pic>
+              </a:graphicData>
+            </a:graphic>
+          </wp:inline>
+        </w:drawing>
       </w:r>
     </w:p>
     <w:p>
@@ -11470,29 +11292,11 @@
           <w:iCs/>
           <w:color w:val="999999"/>
         </w:rPr>
-        <w:t xml:space="preserve">[Pendiente: insertar aquí las capturas de pantalla tomadas en su equipo, mostrando usuario, </w:t>
-      </w:r>
-      <w:proofErr w:type="spellStart"/>
-      <w:r>
-        <w:rPr>
-          <w:i/>
-          <w:iCs/>
-          <w:color w:val="999999"/>
-        </w:rPr>
-        <w:t>hostname</w:t>
-      </w:r>
-      <w:proofErr w:type="spellEnd"/>
-      <w:r>
-        <w:rPr>
-          <w:i/>
-          <w:iCs/>
-          <w:color w:val="999999"/>
-        </w:rPr>
-        <w:t xml:space="preserve"> y fecha en la misma terminal donde se ejecute un componente del proyecto o se conecte a la instancia desplegada.]</w:t>
+        <w:t>[Pendiente: insertar aquí las capturas de pantalla tomadas en su equipo, mostrando usuario, hostname y fecha en la misma terminal donde se ejecute un componente del proyecto o se conecte a la instancia desplegada.]</w:t>
       </w:r>
     </w:p>
     <w:sectPr>
-      <w:footerReference w:type="default" r:id="rId18"/>
+      <w:footerReference w:type="default" r:id="rId27"/>
       <w:pgSz w:w="12240" w:h="15840"/>
       <w:pgMar w:top="1440" w:right="1440" w:bottom="1440" w:left="1440" w:header="708" w:footer="708" w:gutter="0"/>
       <w:cols w:space="720"/>
@@ -12169,7 +11973,6 @@
   <w:style w:type="character" w:default="1" w:styleId="Fuentedeprrafopredeter">
     <w:name w:val="Default Paragraph Font"/>
     <w:uiPriority w:val="1"/>
-    <w:semiHidden/>
     <w:unhideWhenUsed/>
   </w:style>
   <w:style w:type="table" w:default="1" w:styleId="Tablanormal">

</xml_diff>